<commit_message>
pre-submission: fix prose overclaims and arithmetic per adversarial review; add supplementary metrics; finalize report
Co-Authored-By: Claude Opus 4.6 (1M context) <noreply@anthropic.com>
</commit_message>
<xml_diff>
--- a/report/video_brief.docx
+++ b/report/video_brief.docx
@@ -406,13 +406,13 @@
         <w:t xml:space="preserve">”</w:t>
       </w:r>
       <w:r>
-        <w:t xml:space="preserve">. And YAP segmentation makes inputs 12–20% longer, so it</w:t>
-      </w:r>
-      <w:r>
-        <w:t xml:space="preserve"> </w:t>
-      </w:r>
-      <w:r>
-        <w:t xml:space="preserve">costs more money for worse accuracy.</w:t>
+        <w:t xml:space="preserve">. And YAP segmentation makes inputs 6–18% longer, so it</w:t>
+      </w:r>
+      <w:r>
+        <w:t xml:space="preserve"> </w:t>
+      </w:r>
+      <w:r>
+        <w:t xml:space="preserve">costs more money for no benefit.</w:t>
       </w:r>
     </w:p>
     <w:p>
@@ -426,21 +426,476 @@
       <w:pPr>
         <w:pStyle w:val="Heading2"/>
       </w:pPr>
-      <w:bookmarkStart w:id="23" w:name="minute-by-minute-script-skeleton"/>
+      <w:bookmarkStart w:id="23" w:name="X145282f35cda750ae01076e20f43d7e49573e83"/>
+      <w:r>
+        <w:t xml:space="preserve">Slide-by-slide timing map (record over report/slides.pptx)</w:t>
+      </w:r>
+      <w:bookmarkEnd w:id="23"/>
+    </w:p>
+    <w:tbl>
+      <w:tblPr>
+        <w:tblStyle w:val="Table"/>
+        <w:tblW w:type="pct" w:w="5000.0"/>
+        <w:tblLook w:firstRow="1"/>
+      </w:tblPr>
+      <w:tblGrid>
+        <w:gridCol w:w="2640"/>
+        <w:gridCol w:w="2640"/>
+        <w:gridCol w:w="2640"/>
+      </w:tblGrid>
+      <w:tr>
+        <w:trPr>
+          <w:cnfStyle w:firstRow="1"/>
+        </w:trPr>
+        <w:tc>
+          <w:tcPr>
+            <w:tcBorders>
+              <w:bottom w:val="single"/>
+            </w:tcBorders>
+            <w:vAlign w:val="bottom"/>
+          </w:tcPr>
+          <w:p>
+            <w:pPr>
+              <w:pStyle w:val="Compact"/>
+              <w:jc w:val="left"/>
+            </w:pPr>
+            <w:r>
+              <w:t xml:space="preserve">Time</w:t>
+            </w:r>
+          </w:p>
+        </w:tc>
+        <w:tc>
+          <w:tcPr>
+            <w:tcBorders>
+              <w:bottom w:val="single"/>
+            </w:tcBorders>
+            <w:vAlign w:val="bottom"/>
+          </w:tcPr>
+          <w:p>
+            <w:pPr>
+              <w:pStyle w:val="Compact"/>
+              <w:jc w:val="left"/>
+            </w:pPr>
+            <w:r>
+              <w:t xml:space="preserve">Slide</w:t>
+            </w:r>
+          </w:p>
+        </w:tc>
+        <w:tc>
+          <w:tcPr>
+            <w:tcBorders>
+              <w:bottom w:val="single"/>
+            </w:tcBorders>
+            <w:vAlign w:val="bottom"/>
+          </w:tcPr>
+          <w:p>
+            <w:pPr>
+              <w:pStyle w:val="Compact"/>
+              <w:jc w:val="left"/>
+            </w:pPr>
+            <w:r>
+              <w:t xml:space="preserve">Content</w:t>
+            </w:r>
+          </w:p>
+        </w:tc>
+      </w:tr>
+      <w:tr>
+        <w:tc>
+          <w:p>
+            <w:pPr>
+              <w:pStyle w:val="Compact"/>
+              <w:jc w:val="left"/>
+            </w:pPr>
+            <w:r>
+              <w:t xml:space="preserve">0:00-0:15</w:t>
+            </w:r>
+          </w:p>
+        </w:tc>
+        <w:tc>
+          <w:p>
+            <w:pPr>
+              <w:pStyle w:val="Compact"/>
+              <w:jc w:val="left"/>
+            </w:pPr>
+            <w:r>
+              <w:t xml:space="preserve">1 · Title</w:t>
+            </w:r>
+          </w:p>
+        </w:tc>
+        <w:tc>
+          <w:p>
+            <w:pPr>
+              <w:pStyle w:val="Compact"/>
+              <w:jc w:val="left"/>
+            </w:pPr>
+            <w:r>
+              <w:t xml:space="preserve">Title as a question + names, one sentence</w:t>
+            </w:r>
+          </w:p>
+        </w:tc>
+      </w:tr>
+      <w:tr>
+        <w:tc>
+          <w:p>
+            <w:pPr>
+              <w:pStyle w:val="Compact"/>
+              <w:jc w:val="left"/>
+            </w:pPr>
+            <w:r>
+              <w:t xml:space="preserve">0:15-0:55</w:t>
+            </w:r>
+          </w:p>
+        </w:tc>
+        <w:tc>
+          <w:p>
+            <w:pPr>
+              <w:pStyle w:val="Compact"/>
+              <w:jc w:val="left"/>
+            </w:pPr>
+            <w:r>
+              <w:t xml:space="preserve">2 · The question</w:t>
+            </w:r>
+          </w:p>
+        </w:tc>
+        <w:tc>
+          <w:p>
+            <w:pPr>
+              <w:pStyle w:val="Compact"/>
+              <w:jc w:val="left"/>
+            </w:pPr>
+            <w:r>
+              <w:t xml:space="preserve">The Hebrew-word hook, 30 years of segment-first, RQ1 + RQ2</w:t>
+            </w:r>
+          </w:p>
+        </w:tc>
+      </w:tr>
+      <w:tr>
+        <w:tc>
+          <w:p>
+            <w:pPr>
+              <w:pStyle w:val="Compact"/>
+              <w:jc w:val="left"/>
+            </w:pPr>
+            <w:r>
+              <w:t xml:space="preserve">0:55-1:40</w:t>
+            </w:r>
+          </w:p>
+        </w:tc>
+        <w:tc>
+          <w:p>
+            <w:pPr>
+              <w:pStyle w:val="Compact"/>
+              <w:jc w:val="left"/>
+            </w:pPr>
+            <w:r>
+              <w:t xml:space="preserve">3 · The experiment</w:t>
+            </w:r>
+          </w:p>
+        </w:tc>
+        <w:tc>
+          <w:p>
+            <w:pPr>
+              <w:pStyle w:val="Compact"/>
+              <w:jc w:val="left"/>
+            </w:pPr>
+            <w:r>
+              <w:t xml:space="preserve">4x3x3 matrix, one sentence three ways, rigor sentence</w:t>
+            </w:r>
+          </w:p>
+        </w:tc>
+      </w:tr>
+      <w:tr>
+        <w:tc>
+          <w:p>
+            <w:pPr>
+              <w:pStyle w:val="Compact"/>
+              <w:jc w:val="left"/>
+            </w:pPr>
+            <w:r>
+              <w:t xml:space="preserve">1:40-2:20</w:t>
+            </w:r>
+          </w:p>
+        </w:tc>
+        <w:tc>
+          <w:p>
+            <w:pPr>
+              <w:pStyle w:val="Compact"/>
+              <w:jc w:val="left"/>
+            </w:pPr>
+            <w:r>
+              <w:t xml:space="preserve">4 · Results</w:t>
+            </w:r>
+          </w:p>
+        </w:tc>
+        <w:tc>
+          <w:p>
+            <w:pPr>
+              <w:pStyle w:val="Compact"/>
+              <w:jc w:val="left"/>
+            </w:pPr>
+            <w:r>
+              <w:t xml:space="preserve">NLI table:</w:t>
+            </w:r>
+            <w:r>
+              <w:t xml:space="preserve"> </w:t>
+            </w:r>
+            <w:r>
+              <w:t xml:space="preserve">“</w:t>
+            </w:r>
+            <w:r>
+              <w:t xml:space="preserve">no model got better - most got worse</w:t>
+            </w:r>
+            <w:r>
+              <w:t xml:space="preserve">”</w:t>
+            </w:r>
+            <w:r>
+              <w:t xml:space="preserve">; walk the red column</w:t>
+            </w:r>
+          </w:p>
+        </w:tc>
+      </w:tr>
+      <w:tr>
+        <w:tc>
+          <w:p>
+            <w:pPr>
+              <w:pStyle w:val="Compact"/>
+              <w:jc w:val="left"/>
+            </w:pPr>
+            <w:r>
+              <w:t xml:space="preserve">2:20-2:50</w:t>
+            </w:r>
+          </w:p>
+        </w:tc>
+        <w:tc>
+          <w:p>
+            <w:pPr>
+              <w:pStyle w:val="Compact"/>
+              <w:jc w:val="left"/>
+            </w:pPr>
+            <w:r>
+              <w:t xml:space="preserve">5 · Artifact I</w:t>
+            </w:r>
+          </w:p>
+        </w:tc>
+        <w:tc>
+          <w:p>
+            <w:pPr>
+              <w:pStyle w:val="Compact"/>
+              <w:jc w:val="left"/>
+            </w:pPr>
+            <w:r>
+              <w:t xml:space="preserve">QA</w:t>
+            </w:r>
+            <w:r>
+              <w:t xml:space="preserve"> </w:t>
+            </w:r>
+            <w:r>
+              <w:t xml:space="preserve">“</w:t>
+            </w:r>
+            <w:r>
+              <w:t xml:space="preserve">collapse</w:t>
+            </w:r>
+            <w:r>
+              <w:t xml:space="preserve">”</w:t>
+            </w:r>
+            <w:r>
+              <w:t xml:space="preserve">: 0.628 -&gt; 0.424 -&gt; 0.600 (space-insensitive)</w:t>
+            </w:r>
+          </w:p>
+        </w:tc>
+      </w:tr>
+      <w:tr>
+        <w:tc>
+          <w:p>
+            <w:pPr>
+              <w:pStyle w:val="Compact"/>
+              <w:jc w:val="left"/>
+            </w:pPr>
+            <w:r>
+              <w:t xml:space="preserve">2:50-3:20</w:t>
+            </w:r>
+          </w:p>
+        </w:tc>
+        <w:tc>
+          <w:p>
+            <w:pPr>
+              <w:pStyle w:val="Compact"/>
+              <w:jc w:val="left"/>
+            </w:pPr>
+            <w:r>
+              <w:t xml:space="preserve">6 · Artifact II</w:t>
+            </w:r>
+          </w:p>
+        </w:tc>
+        <w:tc>
+          <w:p>
+            <w:pPr>
+              <w:pStyle w:val="Compact"/>
+              <w:jc w:val="left"/>
+            </w:pPr>
+            <w:r>
+              <w:t xml:space="preserve">Claude’s empty answers: 5.3% vs 26.2%; -18.8 became -2.3; two lessons</w:t>
+            </w:r>
+          </w:p>
+        </w:tc>
+      </w:tr>
+      <w:tr>
+        <w:tc>
+          <w:p>
+            <w:pPr>
+              <w:pStyle w:val="Compact"/>
+              <w:jc w:val="left"/>
+            </w:pPr>
+            <w:r>
+              <w:t xml:space="preserve">3:20-3:55</w:t>
+            </w:r>
+          </w:p>
+        </w:tc>
+        <w:tc>
+          <w:p>
+            <w:pPr>
+              <w:pStyle w:val="Compact"/>
+              <w:jc w:val="left"/>
+            </w:pPr>
+            <w:r>
+              <w:t xml:space="preserve">7 · Mechanism</w:t>
+            </w:r>
+          </w:p>
+        </w:tc>
+        <w:tc>
+          <w:p>
+            <w:pPr>
+              <w:pStyle w:val="Compact"/>
+              <w:jc w:val="left"/>
+            </w:pPr>
+            <w:r>
+              <w:t xml:space="preserve">Fertility chart: tokenizers already segment; +12-20% cost</w:t>
+            </w:r>
+          </w:p>
+        </w:tc>
+      </w:tr>
+      <w:tr>
+        <w:tc>
+          <w:p>
+            <w:pPr>
+              <w:pStyle w:val="Compact"/>
+              <w:jc w:val="left"/>
+            </w:pPr>
+            <w:r>
+              <w:t xml:space="preserve">3:55-4:20</w:t>
+            </w:r>
+          </w:p>
+        </w:tc>
+        <w:tc>
+          <w:p>
+            <w:pPr>
+              <w:pStyle w:val="Compact"/>
+              <w:jc w:val="left"/>
+            </w:pPr>
+            <w:r>
+              <w:t xml:space="preserve">8 · Flip taxonomy</w:t>
+            </w:r>
+          </w:p>
+        </w:tc>
+        <w:tc>
+          <w:p>
+            <w:pPr>
+              <w:pStyle w:val="Compact"/>
+              <w:jc w:val="left"/>
+            </w:pPr>
+            <w:r>
+              <w:t xml:space="preserve">Fast tour of the four cards, end on</w:t>
+            </w:r>
+            <w:r>
+              <w:t xml:space="preserve"> </w:t>
+            </w:r>
+            <w:r>
+              <w:t xml:space="preserve">“</w:t>
+            </w:r>
+            <w:r>
+              <w:t xml:space="preserve">no error - still flipped</w:t>
+            </w:r>
+            <w:r>
+              <w:t xml:space="preserve">”</w:t>
+            </w:r>
+          </w:p>
+        </w:tc>
+      </w:tr>
+      <w:tr>
+        <w:tc>
+          <w:p>
+            <w:pPr>
+              <w:pStyle w:val="Compact"/>
+              <w:jc w:val="left"/>
+            </w:pPr>
+            <w:r>
+              <w:t xml:space="preserve">4:20-4:50</w:t>
+            </w:r>
+          </w:p>
+        </w:tc>
+        <w:tc>
+          <w:p>
+            <w:pPr>
+              <w:pStyle w:val="Compact"/>
+              <w:jc w:val="left"/>
+            </w:pPr>
+            <w:r>
+              <w:t xml:space="preserve">9 · Conclusion</w:t>
+            </w:r>
+          </w:p>
+        </w:tc>
+        <w:tc>
+          <w:p>
+            <w:pPr>
+              <w:pStyle w:val="Compact"/>
+              <w:jc w:val="left"/>
+            </w:pPr>
+            <w:r>
+              <w:t xml:space="preserve">“</w:t>
+            </w:r>
+            <w:r>
+              <w:t xml:space="preserve">Feed LLMs raw Hebrew</w:t>
+            </w:r>
+            <w:r>
+              <w:t xml:space="preserve">”</w:t>
+            </w:r>
+            <w:r>
+              <w:t xml:space="preserve"> </w:t>
+            </w:r>
+            <w:r>
+              <w:t xml:space="preserve">+ five bullets; hold the slide</w:t>
+            </w:r>
+          </w:p>
+        </w:tc>
+      </w:tr>
+    </w:tbl>
+    <w:p>
+      <w:pPr>
+        <w:pStyle w:val="BodyText"/>
+      </w:pPr>
+      <w:r>
+        <w:t xml:space="preserve">Target 4:50 total - leaves a safety buffer under the 5:00 limit.</w:t>
+      </w:r>
+    </w:p>
+    <w:p>
+      <w:pPr>
+        <w:pStyle w:val="Heading2"/>
+      </w:pPr>
+      <w:bookmarkStart w:id="24" w:name="minute-by-minute-script-skeleton"/>
       <w:r>
         <w:t xml:space="preserve">Minute-by-minute script skeleton</w:t>
       </w:r>
-      <w:bookmarkEnd w:id="23"/>
+      <w:bookmarkEnd w:id="24"/>
     </w:p>
     <w:p>
       <w:pPr>
         <w:pStyle w:val="Heading3"/>
       </w:pPr>
-      <w:bookmarkStart w:id="24" w:name="the-question-hook-first-then-setup"/>
+      <w:bookmarkStart w:id="25" w:name="the-question-hook-first-then-setup"/>
       <w:r>
         <w:t xml:space="preserve">0:00–0:50 — The question (hook first, then setup)</w:t>
       </w:r>
-      <w:bookmarkEnd w:id="24"/>
+      <w:bookmarkEnd w:id="25"/>
     </w:p>
     <w:p>
       <w:pPr>
@@ -524,11 +979,11 @@
       <w:pPr>
         <w:pStyle w:val="Heading3"/>
       </w:pPr>
-      <w:bookmarkStart w:id="25" w:name="what-we-did-the-experiment-matrix"/>
+      <w:bookmarkStart w:id="26" w:name="what-we-did-the-experiment-matrix"/>
       <w:r>
         <w:t xml:space="preserve">0:50–1:50 — What we did (the experiment matrix)</w:t>
       </w:r>
-      <w:bookmarkEnd w:id="25"/>
+      <w:bookmarkEnd w:id="26"/>
     </w:p>
     <w:p>
       <w:pPr>
@@ -618,11 +1073,11 @@
       <w:pPr>
         <w:pStyle w:val="Heading3"/>
       </w:pPr>
-      <w:bookmarkStart w:id="26" w:name="X38fd3c6b90c3559f36b12a202e039a496d2e100"/>
+      <w:bookmarkStart w:id="27" w:name="X38fd3c6b90c3559f36b12a202e039a496d2e100"/>
       <w:r>
         <w:t xml:space="preserve">1:50–3:20 — Results (the core; spend the most time here)</w:t>
       </w:r>
-      <w:bookmarkEnd w:id="26"/>
+      <w:bookmarkEnd w:id="27"/>
     </w:p>
     <w:p>
       <w:pPr>
@@ -712,11 +1167,11 @@
       <w:pPr>
         <w:pStyle w:val="Heading3"/>
       </w:pPr>
-      <w:bookmarkStart w:id="27" w:name="why-the-mechanism"/>
+      <w:bookmarkStart w:id="28" w:name="why-the-mechanism"/>
       <w:r>
         <w:t xml:space="preserve">3:20–4:20 — Why (the mechanism)</w:t>
       </w:r>
-      <w:bookmarkEnd w:id="27"/>
+      <w:bookmarkEnd w:id="28"/>
     </w:p>
     <w:p>
       <w:pPr>
@@ -784,7 +1239,7 @@
         <w:t xml:space="preserve">“</w:t>
       </w:r>
       <w:r>
-        <w:t xml:space="preserve">and it makes every request 12–20% more expensive.</w:t>
+        <w:t xml:space="preserve">and it makes every request 6–18% more expensive.</w:t>
       </w:r>
       <w:r>
         <w:t xml:space="preserve">”</w:t>
@@ -794,11 +1249,11 @@
       <w:pPr>
         <w:pStyle w:val="Heading3"/>
       </w:pPr>
-      <w:bookmarkStart w:id="28" w:name="conclusion"/>
+      <w:bookmarkStart w:id="29" w:name="conclusion"/>
       <w:r>
         <w:t xml:space="preserve">4:20–5:00 — Conclusion</w:t>
       </w:r>
-      <w:bookmarkEnd w:id="28"/>
+      <w:bookmarkEnd w:id="29"/>
     </w:p>
     <w:p>
       <w:pPr>
@@ -919,11 +1374,11 @@
       <w:pPr>
         <w:pStyle w:val="Heading2"/>
       </w:pPr>
-      <w:bookmarkStart w:id="29" w:name="Xce5c7ba62bc0390e81bbcfeb6a49edb1a0ac03d"/>
+      <w:bookmarkStart w:id="30" w:name="Xce5c7ba62bc0390e81bbcfeb6a49edb1a0ac03d"/>
       <w:r>
         <w:t xml:space="preserve">What to show on screen (slides/visuals checklist)</w:t>
       </w:r>
-      <w:bookmarkEnd w:id="29"/>
+      <w:bookmarkEnd w:id="30"/>
     </w:p>
     <w:p>
       <w:pPr>
@@ -1031,11 +1486,11 @@
       <w:pPr>
         <w:pStyle w:val="Heading2"/>
       </w:pPr>
-      <w:bookmarkStart w:id="30" w:name="production-tips"/>
+      <w:bookmarkStart w:id="31" w:name="production-tips"/>
       <w:r>
         <w:t xml:space="preserve">Production tips</w:t>
       </w:r>
-      <w:bookmarkEnd w:id="30"/>
+      <w:bookmarkEnd w:id="31"/>
     </w:p>
     <w:p>
       <w:pPr>
@@ -1119,11 +1574,11 @@
       <w:pPr>
         <w:pStyle w:val="Heading2"/>
       </w:pPr>
-      <w:bookmarkStart w:id="31" w:name="where-everything-lives"/>
+      <w:bookmarkStart w:id="32" w:name="where-everything-lives"/>
       <w:r>
         <w:t xml:space="preserve">Where everything lives</w:t>
       </w:r>
-      <w:bookmarkEnd w:id="31"/>
+      <w:bookmarkEnd w:id="32"/>
     </w:p>
     <w:p>
       <w:pPr>

</xml_diff>